<commit_message>
Updated summary of relation
</commit_message>
<xml_diff>
--- a/Relazione.docx
+++ b/Relazione.docx
@@ -491,7 +491,7 @@
             </w:rPr>
             <w:fldChar w:fldCharType="separate"/>
           </w:r>
-          <w:hyperlink w:anchor="_Toc199775997" w:history="1">
+          <w:hyperlink w:anchor="_Toc199776785" w:history="1">
             <w:r>
               <w:rPr>
                 <w:rStyle w:val="Collegamentoipertestuale"/>
@@ -518,7 +518,7 @@
                 <w:noProof/>
                 <w:webHidden/>
               </w:rPr>
-              <w:instrText xml:space="preserve"> PAGEREF _Toc199775997 \h </w:instrText>
+              <w:instrText xml:space="preserve"> PAGEREF _Toc199776785 \h </w:instrText>
             </w:r>
             <w:r>
               <w:rPr>
@@ -563,7 +563,7 @@
               <w:lang w:eastAsia="it-IT"/>
             </w:rPr>
           </w:pPr>
-          <w:hyperlink w:anchor="_Toc199775998" w:history="1">
+          <w:hyperlink w:anchor="_Toc199776786" w:history="1">
             <w:r>
               <w:rPr>
                 <w:rStyle w:val="Collegamentoipertestuale"/>
@@ -590,7 +590,7 @@
                 <w:noProof/>
                 <w:webHidden/>
               </w:rPr>
-              <w:instrText xml:space="preserve"> PAGEREF _Toc199775998 \h </w:instrText>
+              <w:instrText xml:space="preserve"> PAGEREF _Toc199776786 \h </w:instrText>
             </w:r>
             <w:r>
               <w:rPr>
@@ -635,7 +635,7 @@
               <w:lang w:eastAsia="it-IT"/>
             </w:rPr>
           </w:pPr>
-          <w:hyperlink w:anchor="_Toc199775999" w:history="1">
+          <w:hyperlink w:anchor="_Toc199776787" w:history="1">
             <w:r>
               <w:rPr>
                 <w:rStyle w:val="Collegamentoipertestuale"/>
@@ -662,7 +662,7 @@
                 <w:noProof/>
                 <w:webHidden/>
               </w:rPr>
-              <w:instrText xml:space="preserve"> PAGEREF _Toc199775999 \h </w:instrText>
+              <w:instrText xml:space="preserve"> PAGEREF _Toc199776787 \h </w:instrText>
             </w:r>
             <w:r>
               <w:rPr>
@@ -707,7 +707,7 @@
               <w:lang w:eastAsia="it-IT"/>
             </w:rPr>
           </w:pPr>
-          <w:hyperlink w:anchor="_Toc199776000" w:history="1">
+          <w:hyperlink w:anchor="_Toc199776788" w:history="1">
             <w:r>
               <w:rPr>
                 <w:rStyle w:val="Collegamentoipertestuale"/>
@@ -734,7 +734,7 @@
                 <w:noProof/>
                 <w:webHidden/>
               </w:rPr>
-              <w:instrText xml:space="preserve"> PAGEREF _Toc199776000 \h </w:instrText>
+              <w:instrText xml:space="preserve"> PAGEREF _Toc199776788 \h </w:instrText>
             </w:r>
             <w:r>
               <w:rPr>
@@ -779,7 +779,7 @@
               <w:lang w:eastAsia="it-IT"/>
             </w:rPr>
           </w:pPr>
-          <w:hyperlink w:anchor="_Toc199776001" w:history="1">
+          <w:hyperlink w:anchor="_Toc199776789" w:history="1">
             <w:r>
               <w:rPr>
                 <w:rStyle w:val="Collegamentoipertestuale"/>
@@ -806,7 +806,7 @@
                 <w:noProof/>
                 <w:webHidden/>
               </w:rPr>
-              <w:instrText xml:space="preserve"> PAGEREF _Toc199776001 \h </w:instrText>
+              <w:instrText xml:space="preserve"> PAGEREF _Toc199776789 \h </w:instrText>
             </w:r>
             <w:r>
               <w:rPr>
@@ -851,7 +851,7 @@
               <w:lang w:eastAsia="it-IT"/>
             </w:rPr>
           </w:pPr>
-          <w:hyperlink w:anchor="_Toc199776002" w:history="1">
+          <w:hyperlink w:anchor="_Toc199776790" w:history="1">
             <w:r>
               <w:rPr>
                 <w:rStyle w:val="Collegamentoipertestuale"/>
@@ -878,7 +878,7 @@
                 <w:noProof/>
                 <w:webHidden/>
               </w:rPr>
-              <w:instrText xml:space="preserve"> PAGEREF _Toc199776002 \h </w:instrText>
+              <w:instrText xml:space="preserve"> PAGEREF _Toc199776790 \h </w:instrText>
             </w:r>
             <w:r>
               <w:rPr>
@@ -923,7 +923,7 @@
               <w:lang w:eastAsia="it-IT"/>
             </w:rPr>
           </w:pPr>
-          <w:hyperlink w:anchor="_Toc199776003" w:history="1">
+          <w:hyperlink w:anchor="_Toc199776791" w:history="1">
             <w:r>
               <w:rPr>
                 <w:rStyle w:val="Collegamentoipertestuale"/>
@@ -950,7 +950,7 @@
                 <w:noProof/>
                 <w:webHidden/>
               </w:rPr>
-              <w:instrText xml:space="preserve"> PAGEREF _Toc199776003 \h </w:instrText>
+              <w:instrText xml:space="preserve"> PAGEREF _Toc199776791 \h </w:instrText>
             </w:r>
             <w:r>
               <w:rPr>
@@ -995,7 +995,7 @@
               <w:lang w:eastAsia="it-IT"/>
             </w:rPr>
           </w:pPr>
-          <w:hyperlink w:anchor="_Toc199776004" w:history="1">
+          <w:hyperlink w:anchor="_Toc199776792" w:history="1">
             <w:r>
               <w:rPr>
                 <w:rStyle w:val="Collegamentoipertestuale"/>
@@ -1022,7 +1022,7 @@
                 <w:noProof/>
                 <w:webHidden/>
               </w:rPr>
-              <w:instrText xml:space="preserve"> PAGEREF _Toc199776004 \h </w:instrText>
+              <w:instrText xml:space="preserve"> PAGEREF _Toc199776792 \h </w:instrText>
             </w:r>
             <w:r>
               <w:rPr>
@@ -1067,7 +1067,7 @@
               <w:lang w:eastAsia="it-IT"/>
             </w:rPr>
           </w:pPr>
-          <w:hyperlink w:anchor="_Toc199776005" w:history="1">
+          <w:hyperlink w:anchor="_Toc199776793" w:history="1">
             <w:r>
               <w:rPr>
                 <w:rStyle w:val="Collegamentoipertestuale"/>
@@ -1094,7 +1094,7 @@
                 <w:noProof/>
                 <w:webHidden/>
               </w:rPr>
-              <w:instrText xml:space="preserve"> PAGEREF _Toc199776005 \h </w:instrText>
+              <w:instrText xml:space="preserve"> PAGEREF _Toc199776793 \h </w:instrText>
             </w:r>
             <w:r>
               <w:rPr>
@@ -1139,7 +1139,7 @@
               <w:lang w:eastAsia="it-IT"/>
             </w:rPr>
           </w:pPr>
-          <w:hyperlink w:anchor="_Toc199776006" w:history="1">
+          <w:hyperlink w:anchor="_Toc199776794" w:history="1">
             <w:r>
               <w:rPr>
                 <w:rStyle w:val="Collegamentoipertestuale"/>
@@ -1166,7 +1166,7 @@
                 <w:noProof/>
                 <w:webHidden/>
               </w:rPr>
-              <w:instrText xml:space="preserve"> PAGEREF _Toc199776006 \h </w:instrText>
+              <w:instrText xml:space="preserve"> PAGEREF _Toc199776794 \h </w:instrText>
             </w:r>
             <w:r>
               <w:rPr>
@@ -1211,7 +1211,7 @@
               <w:lang w:eastAsia="it-IT"/>
             </w:rPr>
           </w:pPr>
-          <w:hyperlink w:anchor="_Toc199776007" w:history="1">
+          <w:hyperlink w:anchor="_Toc199776795" w:history="1">
             <w:r>
               <w:rPr>
                 <w:rStyle w:val="Collegamentoipertestuale"/>
@@ -1238,7 +1238,7 @@
                 <w:noProof/>
                 <w:webHidden/>
               </w:rPr>
-              <w:instrText xml:space="preserve"> PAGEREF _Toc199776007 \h </w:instrText>
+              <w:instrText xml:space="preserve"> PAGEREF _Toc199776795 \h </w:instrText>
             </w:r>
             <w:r>
               <w:rPr>
@@ -1283,7 +1283,7 @@
               <w:lang w:eastAsia="it-IT"/>
             </w:rPr>
           </w:pPr>
-          <w:hyperlink w:anchor="_Toc199776008" w:history="1">
+          <w:hyperlink w:anchor="_Toc199776796" w:history="1">
             <w:r>
               <w:rPr>
                 <w:rStyle w:val="Collegamentoipertestuale"/>
@@ -1310,7 +1310,7 @@
                 <w:noProof/>
                 <w:webHidden/>
               </w:rPr>
-              <w:instrText xml:space="preserve"> PAGEREF _Toc199776008 \h </w:instrText>
+              <w:instrText xml:space="preserve"> PAGEREF _Toc199776796 \h </w:instrText>
             </w:r>
             <w:r>
               <w:rPr>
@@ -1355,7 +1355,7 @@
               <w:lang w:eastAsia="it-IT"/>
             </w:rPr>
           </w:pPr>
-          <w:hyperlink w:anchor="_Toc199776009" w:history="1">
+          <w:hyperlink w:anchor="_Toc199776797" w:history="1">
             <w:r>
               <w:rPr>
                 <w:rStyle w:val="Collegamentoipertestuale"/>
@@ -1382,7 +1382,7 @@
                 <w:noProof/>
                 <w:webHidden/>
               </w:rPr>
-              <w:instrText xml:space="preserve"> PAGEREF _Toc199776009 \h </w:instrText>
+              <w:instrText xml:space="preserve"> PAGEREF _Toc199776797 \h </w:instrText>
             </w:r>
             <w:r>
               <w:rPr>
@@ -1427,7 +1427,7 @@
               <w:lang w:eastAsia="it-IT"/>
             </w:rPr>
           </w:pPr>
-          <w:hyperlink w:anchor="_Toc199776010" w:history="1">
+          <w:hyperlink w:anchor="_Toc199776798" w:history="1">
             <w:r>
               <w:rPr>
                 <w:rStyle w:val="Collegamentoipertestuale"/>
@@ -1454,7 +1454,7 @@
                 <w:noProof/>
                 <w:webHidden/>
               </w:rPr>
-              <w:instrText xml:space="preserve"> PAGEREF _Toc199776010 \h </w:instrText>
+              <w:instrText xml:space="preserve"> PAGEREF _Toc199776798 \h </w:instrText>
             </w:r>
             <w:r>
               <w:rPr>
@@ -1475,6 +1475,78 @@
                 <w:webHidden/>
               </w:rPr>
               <w:t>17</w:t>
+            </w:r>
+            <w:r>
+              <w:rPr>
+                <w:noProof/>
+                <w:webHidden/>
+              </w:rPr>
+              <w:fldChar w:fldCharType="end"/>
+            </w:r>
+          </w:hyperlink>
+        </w:p>
+        <w:p>
+          <w:pPr>
+            <w:pStyle w:val="Sommario1"/>
+            <w:tabs>
+              <w:tab w:val="right" w:leader="dot" w:pos="9771"/>
+            </w:tabs>
+            <w:rPr>
+              <w:rFonts w:asciiTheme="minorHAnsi" w:eastAsiaTheme="minorEastAsia" w:hAnsiTheme="minorHAnsi"/>
+              <w:noProof/>
+              <w:sz w:val="24"/>
+              <w:szCs w:val="24"/>
+              <w:lang w:eastAsia="it-IT"/>
+            </w:rPr>
+          </w:pPr>
+          <w:hyperlink w:anchor="_Toc199776799" w:history="1">
+            <w:r>
+              <w:rPr>
+                <w:rStyle w:val="Collegamentoipertestuale"/>
+                <w:noProof/>
+              </w:rPr>
+              <w:t>Conclusioni</w:t>
+            </w:r>
+            <w:r>
+              <w:rPr>
+                <w:noProof/>
+                <w:webHidden/>
+              </w:rPr>
+              <w:tab/>
+            </w:r>
+            <w:r>
+              <w:rPr>
+                <w:noProof/>
+                <w:webHidden/>
+              </w:rPr>
+              <w:fldChar w:fldCharType="begin"/>
+            </w:r>
+            <w:r>
+              <w:rPr>
+                <w:noProof/>
+                <w:webHidden/>
+              </w:rPr>
+              <w:instrText xml:space="preserve"> PAGEREF _Toc199776799 \h </w:instrText>
+            </w:r>
+            <w:r>
+              <w:rPr>
+                <w:noProof/>
+                <w:webHidden/>
+              </w:rPr>
+            </w:r>
+            <w:r>
+              <w:rPr>
+                <w:noProof/>
+                <w:webHidden/>
+              </w:rPr>
+              <w:fldChar w:fldCharType="separate"/>
+            </w:r>
+            <w:r>
+              <w:rPr>
+                <w:noProof/>
+                <w:webHidden/>
+              </w:rPr>
+              <w:t>19</w:t>
             </w:r>
             <w:r>
               <w:rPr>
@@ -1513,7 +1585,7 @@
         <w:pStyle w:val="Titolo1"/>
         <w:spacing w:line="360" w:lineRule="auto"/>
       </w:pPr>
-      <w:bookmarkStart w:id="0" w:name="_Toc199775997"/>
+      <w:bookmarkStart w:id="0" w:name="_Toc199776785"/>
       <w:r>
         <w:lastRenderedPageBreak/>
         <w:t>Introduzione</w:t>
@@ -1525,7 +1597,7 @@
         <w:pStyle w:val="Titolo2"/>
         <w:spacing w:line="360" w:lineRule="auto"/>
       </w:pPr>
-      <w:bookmarkStart w:id="1" w:name="_Toc199775998"/>
+      <w:bookmarkStart w:id="1" w:name="_Toc199776786"/>
       <w:r>
         <w:t>Contesto del progetto</w:t>
       </w:r>
@@ -1536,31 +1608,7 @@
         <w:spacing w:line="360" w:lineRule="auto"/>
       </w:pPr>
       <w:r>
-        <w:t xml:space="preserve">Lo scopo del progetto `e quello di </w:t>
-      </w:r>
-      <w:proofErr w:type="spellStart"/>
-      <w:r>
-        <w:t>implemen</w:t>
-      </w:r>
-      <w:proofErr w:type="spellEnd"/>
-      <w:r>
-        <w:t xml:space="preserve"> tare una mini-libreria che esegua i seguenti solutori iterativi, limitatamente al caso di matrici simmetriche e definite positive: metodo di </w:t>
-      </w:r>
-      <w:proofErr w:type="spellStart"/>
-      <w:r>
-        <w:t>Jacobi</w:t>
-      </w:r>
-      <w:proofErr w:type="spellEnd"/>
-      <w:r>
-        <w:t xml:space="preserve">, metodo di </w:t>
-      </w:r>
-      <w:proofErr w:type="spellStart"/>
-      <w:r>
-        <w:t>Gauß</w:t>
-      </w:r>
-      <w:proofErr w:type="spellEnd"/>
-      <w:r>
-        <w:t>-Seidel, metodo del Gradiente, metodo del Gradiente coniugato.</w:t>
+        <w:t>Lo scopo del progetto `e quello di implemen tare una mini-libreria che esegua i seguenti solutori iterativi, limitatamente al caso di matrici simmetriche e definite positive: metodo di Jacobi, metodo di Gauß-Seidel, metodo del Gradiente, metodo del Gradiente coniugato.</w:t>
       </w:r>
     </w:p>
     <w:p>
@@ -1568,7 +1616,7 @@
         <w:pStyle w:val="Titolo2"/>
         <w:spacing w:line="360" w:lineRule="auto"/>
       </w:pPr>
-      <w:bookmarkStart w:id="2" w:name="_Toc199775999"/>
+      <w:bookmarkStart w:id="2" w:name="_Toc199776787"/>
       <w:r>
         <w:t>Linguaggio e librerie scelte</w:t>
       </w:r>
@@ -1582,25 +1630,7 @@
         <w:t xml:space="preserve">Come linguaggio è stato scelto Julia </w:t>
       </w:r>
       <w:r>
-        <w:t xml:space="preserve">inquanto, oltre ad essere open source, implementa al suo interno funzioni efficienti per operazioni su vettori e matrici tramite la libreria </w:t>
-      </w:r>
-      <w:proofErr w:type="spellStart"/>
-      <w:proofErr w:type="gramStart"/>
-      <w:r>
-        <w:t>LinearAlgebra</w:t>
-      </w:r>
-      <w:proofErr w:type="spellEnd"/>
-      <w:proofErr w:type="gramEnd"/>
-      <w:r>
-        <w:t xml:space="preserve"> e la libreria </w:t>
-      </w:r>
-      <w:proofErr w:type="spellStart"/>
-      <w:r>
-        <w:t>SparseArray</w:t>
-      </w:r>
-      <w:proofErr w:type="spellEnd"/>
-      <w:r>
-        <w:t>, offrendo così un supporto nativo per vettori e matrici, permettendo così di gestire e lavorare anche con matrici sparse nativamente; In oltre la sua compilazione just-in-time e le alte prestazioni lo rendono molto utilizzato in matematica e per i calcoli matematici.</w:t>
+        <w:t>inquanto, oltre ad essere open source, implementa al suo interno funzioni efficienti per operazioni su vettori e matrici tramite la libreria LinearAlgebra e la libreria SparseArray, offrendo così un supporto nativo per vettori e matrici, permettendo così di gestire e lavorare anche con matrici sparse nativamente; In oltre la sua compilazione just-in-time e le alte prestazioni lo rendono molto utilizzato in matematica e per i calcoli matematici.</w:t>
       </w:r>
     </w:p>
     <w:p>
@@ -1617,7 +1647,7 @@
         <w:pStyle w:val="Titolo1"/>
         <w:spacing w:line="360" w:lineRule="auto"/>
       </w:pPr>
-      <w:bookmarkStart w:id="3" w:name="_Toc199776000"/>
+      <w:bookmarkStart w:id="3" w:name="_Toc199776788"/>
       <w:r>
         <w:lastRenderedPageBreak/>
         <w:t>Implementazione</w:t>
@@ -1629,7 +1659,7 @@
         <w:pStyle w:val="Titolo2"/>
         <w:spacing w:line="360" w:lineRule="auto"/>
       </w:pPr>
-      <w:bookmarkStart w:id="4" w:name="_Toc199776001"/>
+      <w:bookmarkStart w:id="4" w:name="_Toc199776789"/>
       <w:r>
         <w:t xml:space="preserve">Struttura </w:t>
       </w:r>
@@ -1665,15 +1695,7 @@
         <w:spacing w:line="360" w:lineRule="auto"/>
       </w:pPr>
       <w:r>
-        <w:t xml:space="preserve">La classe </w:t>
-      </w:r>
-      <w:proofErr w:type="spellStart"/>
-      <w:r>
-        <w:t>Main</w:t>
-      </w:r>
-      <w:proofErr w:type="spellEnd"/>
-      <w:r>
-        <w:t xml:space="preserve"> </w:t>
+        <w:t xml:space="preserve">La classe Main </w:t>
       </w:r>
       <w:r>
         <w:t xml:space="preserve">prende in input le matrici presenti nei file </w:t>
@@ -1713,7 +1735,7 @@
         <w:pStyle w:val="Titolo2"/>
         <w:spacing w:line="360" w:lineRule="auto"/>
       </w:pPr>
-      <w:bookmarkStart w:id="5" w:name="_Toc199776002"/>
+      <w:bookmarkStart w:id="5" w:name="_Toc199776790"/>
       <w:r>
         <w:t>Organizzazione della libreria</w:t>
       </w:r>
@@ -1754,55 +1776,20 @@
         <w:spacing w:line="360" w:lineRule="auto"/>
       </w:pPr>
       <w:r>
-        <w:t xml:space="preserve">Funzione: </w:t>
-      </w:r>
-      <w:proofErr w:type="spellStart"/>
-      <w:r>
-        <w:t>load_</w:t>
+        <w:t>Funzione: load_</w:t>
       </w:r>
       <w:r>
         <w:t>sparse_</w:t>
       </w:r>
-      <w:proofErr w:type="gramStart"/>
-      <w:r>
-        <w:t>matrix</w:t>
-      </w:r>
-      <w:proofErr w:type="spellEnd"/>
-      <w:r>
-        <w:t>(</w:t>
-      </w:r>
-      <w:proofErr w:type="spellStart"/>
-      <w:proofErr w:type="gramEnd"/>
-      <w:r>
-        <w:t>file</w:t>
-      </w:r>
-      <w:r>
-        <w:t>_</w:t>
-      </w:r>
-      <w:proofErr w:type="gramStart"/>
-      <w:r>
-        <w:t>path</w:t>
-      </w:r>
-      <w:proofErr w:type="spellEnd"/>
-      <w:r>
-        <w:t>::</w:t>
-      </w:r>
-      <w:proofErr w:type="spellStart"/>
-      <w:proofErr w:type="gramEnd"/>
-      <w:r>
-        <w:t>String</w:t>
-      </w:r>
-      <w:proofErr w:type="spellEnd"/>
-      <w:proofErr w:type="gramStart"/>
-      <w:r>
-        <w:t>)::</w:t>
-      </w:r>
-      <w:proofErr w:type="spellStart"/>
-      <w:proofErr w:type="gramEnd"/>
-      <w:r>
-        <w:t>SparseMatrixCSC</w:t>
-      </w:r>
-      <w:proofErr w:type="spellEnd"/>
+      <w:r>
+        <w:t>matrix(file</w:t>
+      </w:r>
+      <w:r>
+        <w:t>_path</w:t>
+      </w:r>
+      <w:r>
+        <w:t>::String)::SparseMatrixCSC</w:t>
+      </w:r>
     </w:p>
     <w:p>
       <w:pPr>
@@ -1816,15 +1803,7 @@
         <w:t xml:space="preserve">Scopo: </w:t>
       </w:r>
       <w:r>
-        <w:t xml:space="preserve">La funzione </w:t>
-      </w:r>
-      <w:proofErr w:type="spellStart"/>
-      <w:r>
-        <w:t>load_sparse_matrix</w:t>
-      </w:r>
-      <w:proofErr w:type="spellEnd"/>
-      <w:r>
-        <w:t xml:space="preserve"> legge da un file una matrice sparsa salvata in formato testuale. La prima riga indica il numero di righe, colonne e valori non nulli. Le righe successive contengono i valori non nulli con le rispettive posizioni (riga, colonna, valore). La funzione inizializza una matrice sparsa vuota con le dimensioni indicate e poi inserisce i valori letti nella posizione corretta, restituendo infine la matrice costruita</w:t>
+        <w:t>La funzione load_sparse_matrix legge da un file una matrice sparsa salvata in formato testuale. La prima riga indica il numero di righe, colonne e valori non nulli. Le righe successive contengono i valori non nulli con le rispettive posizioni (riga, colonna, valore). La funzione inizializza una matrice sparsa vuota con le dimensioni indicate e poi inserisce i valori letti nella posizione corretta, restituendo infine la matrice costruita</w:t>
       </w:r>
       <w:r>
         <w:t>.</w:t>
@@ -1842,13 +1821,8 @@
         <w:t xml:space="preserve">Generazione </w:t>
       </w:r>
       <w:r>
-        <w:t xml:space="preserve">b </w:t>
-      </w:r>
-      <w:proofErr w:type="spellStart"/>
-      <w:r>
-        <w:t>vector</w:t>
-      </w:r>
-      <w:proofErr w:type="spellEnd"/>
+        <w:t>b vector</w:t>
+      </w:r>
     </w:p>
     <w:p>
       <w:pPr>
@@ -1859,36 +1833,8 @@
         <w:spacing w:line="360" w:lineRule="auto"/>
       </w:pPr>
       <w:r>
-        <w:t xml:space="preserve">Funzione: </w:t>
-      </w:r>
-      <w:proofErr w:type="spellStart"/>
-      <w:r>
-        <w:t>generate_b_</w:t>
-      </w:r>
-      <w:proofErr w:type="gramStart"/>
-      <w:r>
-        <w:t>vector</w:t>
-      </w:r>
-      <w:proofErr w:type="spellEnd"/>
-      <w:r>
-        <w:t>(A::</w:t>
-      </w:r>
-      <w:proofErr w:type="spellStart"/>
-      <w:proofErr w:type="gramEnd"/>
-      <w:r>
-        <w:t>SparseMatrixCSC</w:t>
-      </w:r>
-      <w:proofErr w:type="spellEnd"/>
-      <w:proofErr w:type="gramStart"/>
-      <w:r>
-        <w:t>)::</w:t>
-      </w:r>
-      <w:proofErr w:type="spellStart"/>
-      <w:proofErr w:type="gramEnd"/>
-      <w:r>
-        <w:t>Vector</w:t>
-      </w:r>
-      <w:proofErr w:type="spellEnd"/>
+        <w:t>Funzione: generate_b_vector(A::SparseMatrixCSC)::Vector</w:t>
+      </w:r>
     </w:p>
     <w:p>
       <w:pPr>
@@ -1900,23 +1846,7 @@
       </w:pPr>
       <w:r>
         <w:lastRenderedPageBreak/>
-        <w:t xml:space="preserve">Il metodo </w:t>
-      </w:r>
-      <w:proofErr w:type="spellStart"/>
-      <w:r>
-        <w:t>generate_b_vector</w:t>
-      </w:r>
-      <w:proofErr w:type="spellEnd"/>
-      <w:r>
-        <w:t xml:space="preserve">(A) genera il vettore dei termini noti b per un sistema lineare </w:t>
-      </w:r>
-      <w:proofErr w:type="spellStart"/>
-      <w:r>
-        <w:t>Ax</w:t>
-      </w:r>
-      <w:proofErr w:type="spellEnd"/>
-      <w:r>
-        <w:t>=b, assumendo come soluzione esatta il vettore x composto da soli 1.</w:t>
+        <w:t>Il metodo generate_b_vector(A) genera il vettore dei termini noti b per un sistema lineare Ax=b, assumendo come soluzione esatta il vettore x composto da soli 1.</w:t>
       </w:r>
     </w:p>
     <w:p>
@@ -1942,45 +1872,11 @@
       <w:r>
         <w:t xml:space="preserve">Funzione: </w:t>
       </w:r>
-      <w:proofErr w:type="spellStart"/>
-      <w:r>
-        <w:t>forward_</w:t>
-      </w:r>
-      <w:proofErr w:type="gramStart"/>
-      <w:r>
-        <w:t>substitutio</w:t>
-      </w:r>
-      <w:r>
-        <w:t>n</w:t>
-      </w:r>
-      <w:proofErr w:type="spellEnd"/>
-      <w:r>
-        <w:t>(A::</w:t>
-      </w:r>
-      <w:proofErr w:type="spellStart"/>
-      <w:proofErr w:type="gramEnd"/>
-      <w:r>
-        <w:t>SparseMatrixCSC</w:t>
-      </w:r>
-      <w:proofErr w:type="spellEnd"/>
-      <w:r>
-        <w:t xml:space="preserve">, </w:t>
-      </w:r>
-      <w:proofErr w:type="gramStart"/>
-      <w:r>
-        <w:t>b::</w:t>
-      </w:r>
-      <w:proofErr w:type="gramEnd"/>
-      <w:r>
-        <w:t>Vector</w:t>
-      </w:r>
-      <w:proofErr w:type="gramStart"/>
-      <w:r>
-        <w:t>)::</w:t>
-      </w:r>
-      <w:proofErr w:type="gramEnd"/>
-      <w:r>
-        <w:t>Vector</w:t>
+      <w:r>
+        <w:t>forward_substitutio</w:t>
+      </w:r>
+      <w:r>
+        <w:t>n(A::SparseMatrixCSC, b::Vector)::Vector</w:t>
       </w:r>
     </w:p>
     <w:p>
@@ -1992,21 +1888,11 @@
         <w:spacing w:line="360" w:lineRule="auto"/>
       </w:pPr>
       <w:r>
-        <w:t xml:space="preserve">La funzione </w:t>
-      </w:r>
-      <w:proofErr w:type="spellStart"/>
-      <w:r>
-        <w:t>forward_substitution</w:t>
-      </w:r>
-      <w:proofErr w:type="spellEnd"/>
-      <w:r>
-        <w:t xml:space="preserve"> risolve un sistema lineare triangolare inferiore </w:t>
-      </w:r>
-      <w:proofErr w:type="spellStart"/>
+        <w:t xml:space="preserve">La funzione forward_substitution risolve un sistema lineare triangolare inferiore </w:t>
+      </w:r>
       <w:r>
         <w:t>Ax</w:t>
       </w:r>
-      <w:proofErr w:type="spellEnd"/>
       <w:r>
         <w:t>=b, dove A è una matrice triangolare inferiore e b è un vettore colonna. Il metodo procede "in avanti", calcolando gli elementi di x uno alla volta, partendo dal primo, utilizzando i valori già calcolati.</w:t>
       </w:r>
@@ -2040,51 +1926,25 @@
         <w:spacing w:line="360" w:lineRule="auto"/>
       </w:pPr>
       <w:r>
-        <w:t xml:space="preserve">Funzione: </w:t>
-      </w:r>
-      <w:proofErr w:type="spellStart"/>
-      <w:r>
-        <w:t>j</w:t>
+        <w:t>Funzione: j</w:t>
       </w:r>
       <w:r>
         <w:t>acobi</w:t>
       </w:r>
       <w:r>
-        <w:t>_</w:t>
-      </w:r>
-      <w:proofErr w:type="gramStart"/>
-      <w:r>
-        <w:t>method</w:t>
-      </w:r>
-      <w:proofErr w:type="spellEnd"/>
-      <w:r>
-        <w:t>(</w:t>
-      </w:r>
-      <w:proofErr w:type="gramEnd"/>
-      <w:r>
-        <w:t xml:space="preserve">A, b, </w:t>
-      </w:r>
-      <w:proofErr w:type="spellStart"/>
-      <w:r>
-        <w:t>tol</w:t>
+        <w:t>_method</w:t>
+      </w:r>
+      <w:r>
+        <w:t>(A, b, tol</w:t>
       </w:r>
       <w:r>
         <w:t>erance</w:t>
       </w:r>
-      <w:proofErr w:type="spellEnd"/>
-      <w:r>
-        <w:t xml:space="preserve">, </w:t>
-      </w:r>
-      <w:proofErr w:type="spellStart"/>
-      <w:r>
-        <w:t>max_iter</w:t>
-      </w:r>
-      <w:r>
-        <w:t>ation</w:t>
-      </w:r>
-      <w:proofErr w:type="spellEnd"/>
-      <w:r>
-        <w:t>=20000</w:t>
+      <w:r>
+        <w:t>, max_iter</w:t>
+      </w:r>
+      <w:r>
+        <w:t>ation=20000</w:t>
       </w:r>
       <w:r>
         <w:t>)</w:t>
@@ -2101,7 +1961,6 @@
       <w:r>
         <w:t xml:space="preserve">La funzione </w:t>
       </w:r>
-      <w:proofErr w:type="spellStart"/>
       <w:r>
         <w:rPr>
           <w:rStyle w:val="CodiceHTML"/>
@@ -2109,21 +1968,18 @@
         </w:rPr>
         <w:t>jacobi_method</w:t>
       </w:r>
-      <w:proofErr w:type="spellEnd"/>
       <w:r>
         <w:t xml:space="preserve"> risolve il sistema lineare</w:t>
       </w:r>
       <w:r>
         <w:t xml:space="preserve"> </w:t>
       </w:r>
-      <w:proofErr w:type="spellStart"/>
       <w:r>
         <w:rPr>
           <w:rStyle w:val="mord"/>
         </w:rPr>
         <w:t>Ax</w:t>
       </w:r>
-      <w:proofErr w:type="spellEnd"/>
       <w:r>
         <w:rPr>
           <w:rStyle w:val="mrel"/>
@@ -2145,18 +2001,8 @@
           <w:b w:val="0"/>
           <w:bCs w:val="0"/>
         </w:rPr>
-        <w:t xml:space="preserve">metodo di </w:t>
-      </w:r>
-      <w:proofErr w:type="spellStart"/>
-      <w:r>
-        <w:rPr>
-          <w:rStyle w:val="Enfasigrassetto"/>
-          <w:b w:val="0"/>
-          <w:bCs w:val="0"/>
-        </w:rPr>
-        <w:t>Jacobi</w:t>
-      </w:r>
-      <w:proofErr w:type="spellEnd"/>
+        <w:t>metodo di Jacobi</w:t>
+      </w:r>
       <w:r>
         <w:t>. Parte da una soluzione iniziale nulla (</w:t>
       </w:r>
@@ -2318,47 +2164,10 @@
         <w:ind w:left="2160"/>
       </w:pPr>
       <w:r>
-        <w:t xml:space="preserve">dove D è la diagonale di A. L'inverso della diagonale viene </w:t>
-      </w:r>
-      <w:proofErr w:type="spellStart"/>
-      <w:r>
-        <w:t>precomputato</w:t>
-      </w:r>
-      <w:proofErr w:type="spellEnd"/>
-      <w:r>
-        <w:t xml:space="preserve"> (</w:t>
-      </w:r>
-      <w:proofErr w:type="spellStart"/>
-      <w:r>
-        <w:t>inv_diag</w:t>
-      </w:r>
-      <w:proofErr w:type="spellEnd"/>
-      <w:r>
-        <w:t>)</w:t>
-      </w:r>
-      <w:r>
-        <w:t xml:space="preserve"> con il metodo </w:t>
-      </w:r>
-      <w:proofErr w:type="spellStart"/>
-      <w:proofErr w:type="gramStart"/>
-      <w:r>
-        <w:t>spdiagm</w:t>
-      </w:r>
-      <w:proofErr w:type="spellEnd"/>
-      <w:r>
-        <w:t>(</w:t>
-      </w:r>
-      <w:proofErr w:type="gramEnd"/>
-      <w:r>
-        <w:t xml:space="preserve">) della libreria </w:t>
-      </w:r>
-      <w:proofErr w:type="spellStart"/>
-      <w:r>
-        <w:t>SparseArray</w:t>
-      </w:r>
-      <w:proofErr w:type="spellEnd"/>
-      <w:r>
-        <w:t>.</w:t>
+        <w:t>dove D è la diagonale di A. L'inverso della diagonale viene precomputato (inv_diag)</w:t>
+      </w:r>
+      <w:r>
+        <w:t xml:space="preserve"> con il metodo spdiagm() della libreria SparseArray.</w:t>
       </w:r>
       <w:r>
         <w:t xml:space="preserve"> </w:t>
@@ -2375,11 +2184,9 @@
         </w:rPr>
         <w:t>|</w:t>
       </w:r>
-      <w:proofErr w:type="spellStart"/>
       <w:r>
         <w:t>Ax</w:t>
       </w:r>
-      <w:proofErr w:type="spellEnd"/>
       <w:r>
         <w:rPr>
           <w:rFonts w:cs="Consolas"/>
@@ -2440,46 +2247,26 @@
       <w:r>
         <w:t xml:space="preserve">Funzione: </w:t>
       </w:r>
-      <w:proofErr w:type="spellStart"/>
       <w:r>
         <w:t>gauss_seidel</w:t>
       </w:r>
       <w:r>
-        <w:t>_</w:t>
-      </w:r>
-      <w:proofErr w:type="gramStart"/>
-      <w:r>
-        <w:t>method</w:t>
-      </w:r>
-      <w:proofErr w:type="spellEnd"/>
+        <w:t>_method</w:t>
+      </w:r>
       <w:r>
         <w:t>(</w:t>
       </w:r>
-      <w:proofErr w:type="gramEnd"/>
-      <w:r>
-        <w:t xml:space="preserve">A, b, </w:t>
-      </w:r>
-      <w:proofErr w:type="spellStart"/>
-      <w:r>
-        <w:t>tol</w:t>
+      <w:r>
+        <w:t>A, b, tol</w:t>
       </w:r>
       <w:r>
         <w:t>erance</w:t>
       </w:r>
-      <w:proofErr w:type="spellEnd"/>
-      <w:r>
-        <w:t xml:space="preserve">, </w:t>
-      </w:r>
-      <w:proofErr w:type="spellStart"/>
-      <w:r>
-        <w:t>max_iter</w:t>
-      </w:r>
-      <w:r>
-        <w:t>ation</w:t>
-      </w:r>
-      <w:proofErr w:type="spellEnd"/>
-      <w:r>
-        <w:t>=20000</w:t>
+      <w:r>
+        <w:t>, max_iter</w:t>
+      </w:r>
+      <w:r>
+        <w:t>ation=20000</w:t>
       </w:r>
       <w:r>
         <w:t>)</w:t>
@@ -2494,23 +2281,7 @@
         <w:spacing w:line="360" w:lineRule="auto"/>
       </w:pPr>
       <w:r>
-        <w:t xml:space="preserve">La funzione </w:t>
-      </w:r>
-      <w:proofErr w:type="spellStart"/>
-      <w:r>
-        <w:t>gauss_seidel_method</w:t>
-      </w:r>
-      <w:proofErr w:type="spellEnd"/>
-      <w:r>
-        <w:t xml:space="preserve"> implementa il metodo iterativo di Gauss-Seidel per risolvere un sistema lineare </w:t>
-      </w:r>
-      <w:proofErr w:type="spellStart"/>
-      <w:r>
-        <w:t>Ax</w:t>
-      </w:r>
-      <w:proofErr w:type="spellEnd"/>
-      <w:r>
-        <w:t xml:space="preserve">=b. Si parte da una soluzione iniziale </w:t>
+        <w:t xml:space="preserve">La funzione gauss_seidel_method implementa il metodo iterativo di Gauss-Seidel per risolvere un sistema lineare Ax=b. Si parte da una soluzione iniziale </w:t>
       </w:r>
       <w:r>
         <w:t>x</w:t>
@@ -2522,15 +2293,7 @@
         <w:t>r</w:t>
       </w:r>
       <w:r>
-        <w:t>=b−</w:t>
-      </w:r>
-      <w:proofErr w:type="spellStart"/>
-      <w:r>
-        <w:t>Ax</w:t>
-      </w:r>
-      <w:proofErr w:type="spellEnd"/>
-      <w:r>
-        <w:t>, ovvero l’errore rispetto alla soluzione esatta.</w:t>
+        <w:t>=b−Ax, ovvero l’errore rispetto alla soluzione esatta.</w:t>
       </w:r>
       <w:r>
         <w:br/>
@@ -2540,15 +2303,7 @@
       </w:r>
       <w:r>
         <w:lastRenderedPageBreak/>
-        <w:t xml:space="preserve">risolvendo un sistema triangolare inferiore </w:t>
-      </w:r>
-      <w:proofErr w:type="spellStart"/>
-      <w:r>
-        <w:t>Lδx</w:t>
-      </w:r>
-      <w:proofErr w:type="spellEnd"/>
-      <w:r>
-        <w:t>=r</w:t>
+        <w:t>risolvendo un sistema triangolare inferiore Lδx=r</w:t>
       </w:r>
       <w:r>
         <w:t>,</w:t>
@@ -2596,52 +2351,32 @@
       <w:r>
         <w:t xml:space="preserve">Funzione: </w:t>
       </w:r>
-      <w:proofErr w:type="spellStart"/>
       <w:r>
         <w:t>gradient_descent</w:t>
       </w:r>
       <w:r>
-        <w:t>_</w:t>
-      </w:r>
-      <w:proofErr w:type="gramStart"/>
-      <w:r>
-        <w:t>method</w:t>
-      </w:r>
-      <w:proofErr w:type="spellEnd"/>
+        <w:t>_method</w:t>
+      </w:r>
       <w:r>
         <w:t>(</w:t>
       </w:r>
-      <w:proofErr w:type="gramEnd"/>
-      <w:r>
-        <w:t xml:space="preserve">A, b, </w:t>
-      </w:r>
-      <w:proofErr w:type="spellStart"/>
-      <w:r>
-        <w:t>tol</w:t>
+      <w:r>
+        <w:t>A, b, tol</w:t>
       </w:r>
       <w:r>
         <w:t>erance</w:t>
       </w:r>
-      <w:proofErr w:type="spellEnd"/>
       <w:r>
         <w:t>,</w:t>
       </w:r>
       <w:r>
-        <w:t xml:space="preserve"> </w:t>
-      </w:r>
-      <w:proofErr w:type="spellStart"/>
-      <w:r>
-        <w:t>m</w:t>
+        <w:t xml:space="preserve"> m</w:t>
       </w:r>
       <w:r>
         <w:t>ax_iter</w:t>
       </w:r>
       <w:r>
-        <w:t>ation</w:t>
-      </w:r>
-      <w:proofErr w:type="spellEnd"/>
-      <w:r>
-        <w:t>=</w:t>
+        <w:t>ation=</w:t>
       </w:r>
       <w:r>
         <w:t xml:space="preserve"> </w:t>
@@ -2662,21 +2397,11 @@
         <w:spacing w:line="360" w:lineRule="auto"/>
       </w:pPr>
       <w:r>
-        <w:t xml:space="preserve">La funzione </w:t>
-      </w:r>
-      <w:proofErr w:type="spellStart"/>
-      <w:r>
-        <w:t>gradient_descent_method</w:t>
-      </w:r>
-      <w:proofErr w:type="spellEnd"/>
-      <w:r>
-        <w:t xml:space="preserve"> risolve il sistema lineare </w:t>
-      </w:r>
-      <w:proofErr w:type="spellStart"/>
+        <w:t xml:space="preserve">La funzione gradient_descent_method risolve il sistema lineare </w:t>
+      </w:r>
       <w:r>
         <w:t>Ax</w:t>
       </w:r>
-      <w:proofErr w:type="spellEnd"/>
       <w:r>
         <w:t>=b per matrici simmetriche e definite positive usando il metodo del gradiente.</w:t>
       </w:r>
@@ -2688,15 +2413,7 @@
         <w:t xml:space="preserve"> </w:t>
       </w:r>
       <w:r>
-        <w:t>Parte da una soluzione iniziale nulla (x = 0) e, ad ogni iterazione, calcola il residuo r=b−</w:t>
-      </w:r>
-      <w:proofErr w:type="spellStart"/>
-      <w:r>
-        <w:t>Ax</w:t>
-      </w:r>
-      <w:proofErr w:type="spellEnd"/>
-      <w:r>
-        <w:t>, che rappresenta la direzione del gradiente del funzionale di errore quadratico.</w:t>
+        <w:t>Parte da una soluzione iniziale nulla (x = 0) e, ad ogni iterazione, calcola il residuo r=b−Ax, che rappresenta la direzione del gradiente del funzionale di errore quadratico.</w:t>
       </w:r>
     </w:p>
     <w:p>
@@ -2705,15 +2422,7 @@
         <w:ind w:left="2160"/>
       </w:pPr>
       <w:r>
-        <w:t>Poi determina un passo ottimale (</w:t>
-      </w:r>
-      <w:proofErr w:type="spellStart"/>
-      <w:r>
-        <w:t>step_size</w:t>
-      </w:r>
-      <w:proofErr w:type="spellEnd"/>
-      <w:r>
-        <w:t>) lungo questa direzione, calcolato come:</w:t>
+        <w:t>Poi determina un passo ottimale (step_size) lungo questa direzione, calcolato come:</w:t>
       </w:r>
     </w:p>
     <w:p>
@@ -2961,13 +2670,8 @@
         </w:rPr>
         <w:t>|</w:t>
       </w:r>
-      <w:proofErr w:type="spellStart"/>
-      <w:r>
-        <w:t>Ax</w:t>
-      </w:r>
-      <w:proofErr w:type="spellEnd"/>
-      <w:r>
-        <w:t>−b</w:t>
+      <w:r>
+        <w:t>Ax−b</w:t>
       </w:r>
       <w:r>
         <w:rPr>
@@ -3003,46 +2707,26 @@
       <w:r>
         <w:t xml:space="preserve">Funzione: </w:t>
       </w:r>
-      <w:proofErr w:type="spellStart"/>
       <w:r>
         <w:t>conjugate_gradient</w:t>
       </w:r>
       <w:r>
-        <w:t>_</w:t>
-      </w:r>
-      <w:proofErr w:type="gramStart"/>
-      <w:r>
-        <w:t>method</w:t>
-      </w:r>
-      <w:proofErr w:type="spellEnd"/>
+        <w:t>_method</w:t>
+      </w:r>
       <w:r>
         <w:t>(</w:t>
       </w:r>
-      <w:proofErr w:type="gramEnd"/>
-      <w:r>
-        <w:t xml:space="preserve">A, b, </w:t>
-      </w:r>
-      <w:proofErr w:type="spellStart"/>
-      <w:r>
-        <w:t>tol</w:t>
+      <w:r>
+        <w:t>A, b, tol</w:t>
       </w:r>
       <w:r>
         <w:t>erance</w:t>
       </w:r>
-      <w:proofErr w:type="spellEnd"/>
-      <w:r>
-        <w:t xml:space="preserve">, </w:t>
-      </w:r>
-      <w:proofErr w:type="spellStart"/>
-      <w:r>
-        <w:t>max_iter</w:t>
-      </w:r>
-      <w:r>
-        <w:t>ation</w:t>
-      </w:r>
-      <w:proofErr w:type="spellEnd"/>
-      <w:r>
-        <w:t>=20000</w:t>
+      <w:r>
+        <w:t>, max_iter</w:t>
+      </w:r>
+      <w:r>
+        <w:t>ation=20000</w:t>
       </w:r>
       <w:r>
         <w:t>)</w:t>
@@ -3057,21 +2741,11 @@
         <w:spacing w:line="360" w:lineRule="auto"/>
       </w:pPr>
       <w:r>
-        <w:t xml:space="preserve">La funzione </w:t>
-      </w:r>
-      <w:proofErr w:type="spellStart"/>
-      <w:r>
-        <w:t>gradient_descent_method</w:t>
-      </w:r>
-      <w:proofErr w:type="spellEnd"/>
-      <w:r>
-        <w:t xml:space="preserve"> risolve il sistema lineare </w:t>
-      </w:r>
-      <w:proofErr w:type="spellStart"/>
+        <w:t xml:space="preserve">La funzione gradient_descent_method risolve il sistema lineare </w:t>
+      </w:r>
       <w:r>
         <w:t>Ax</w:t>
       </w:r>
-      <w:proofErr w:type="spellEnd"/>
       <w:r>
         <w:t>=b per matrici simmetriche e definite positive usando il metodo del gradiente</w:t>
       </w:r>
@@ -3088,15 +2762,7 @@
         <w:t>P</w:t>
       </w:r>
       <w:r>
-        <w:t>arte da una soluzione iniziale x=0, da cui si calcola il primo residuo r0​=b−</w:t>
-      </w:r>
-      <w:proofErr w:type="spellStart"/>
-      <w:r>
-        <w:t>Ax</w:t>
-      </w:r>
-      <w:proofErr w:type="spellEnd"/>
-      <w:r>
-        <w:t>=b, che funge anche da direzione iniziale d0​. A ogni iterazione, si calcola un passo ottimale α</w:t>
+        <w:t>arte da una soluzione iniziale x=0, da cui si calcola il primo residuo r0​=b−Ax=b, che funge anche da direzione iniziale d0​. A ogni iterazione, si calcola un passo ottimale α</w:t>
       </w:r>
       <w:r>
         <w:rPr>
@@ -3298,7 +2964,6 @@
       <w:r>
         <w:t xml:space="preserve">che stabilisce quanto spostarsi lungo la direzione corrente </w:t>
       </w:r>
-      <w:proofErr w:type="spellStart"/>
       <w:r>
         <w:t>d</w:t>
       </w:r>
@@ -3308,7 +2973,6 @@
         </w:rPr>
         <w:t>k</w:t>
       </w:r>
-      <w:proofErr w:type="spellEnd"/>
       <w:r>
         <w:t>​ per aggiornare la soluzione x</w:t>
       </w:r>
@@ -3673,14 +3337,7 @@
         <w:rPr>
           <w:rFonts w:ascii="Cambria Math" w:hAnsi="Cambria Math" w:cs="Cambria Math"/>
         </w:rPr>
-        <w:t>|</w:t>
-      </w:r>
-      <w:proofErr w:type="spellStart"/>
-      <w:r>
-        <w:rPr>
-          <w:rFonts w:ascii="Cambria Math" w:hAnsi="Cambria Math" w:cs="Cambria Math"/>
-        </w:rPr>
-        <w:t>r</w:t>
+        <w:t>|r</w:t>
       </w:r>
       <w:r>
         <w:rPr>
@@ -3689,7 +3346,6 @@
         </w:rPr>
         <w:t>k</w:t>
       </w:r>
-      <w:proofErr w:type="spellEnd"/>
       <w:r>
         <w:rPr>
           <w:rFonts w:ascii="Cambria Math" w:hAnsi="Cambria Math" w:cs="Cambria Math"/>
@@ -3726,7 +3382,7 @@
         <w:pStyle w:val="Titolo2"/>
         <w:spacing w:line="360" w:lineRule="auto"/>
       </w:pPr>
-      <w:bookmarkStart w:id="6" w:name="_Toc199776003"/>
+      <w:bookmarkStart w:id="6" w:name="_Toc199776791"/>
       <w:r>
         <w:t>Esecuzione e test della libreria</w:t>
       </w:r>
@@ -3737,7 +3393,7 @@
         <w:pStyle w:val="Titolo3"/>
         <w:spacing w:line="360" w:lineRule="auto"/>
       </w:pPr>
-      <w:bookmarkStart w:id="7" w:name="_Toc199776004"/>
+      <w:bookmarkStart w:id="7" w:name="_Toc199776792"/>
       <w:r>
         <w:t>Esecuzione dei metodi sulle matrici</w:t>
       </w:r>
@@ -3796,31 +3452,7 @@
         <w:spacing w:line="360" w:lineRule="auto"/>
       </w:pPr>
       <w:r>
-        <w:t xml:space="preserve">Impostazione della soluzione esatta </w:t>
-      </w:r>
-      <w:proofErr w:type="spellStart"/>
-      <w:r>
-        <w:t>x_exact</w:t>
-      </w:r>
-      <w:proofErr w:type="spellEnd"/>
-      <w:r>
-        <w:t xml:space="preserve"> = </w:t>
-      </w:r>
-      <w:proofErr w:type="spellStart"/>
-      <w:r>
-        <w:t>ones</w:t>
-      </w:r>
-      <w:proofErr w:type="spellEnd"/>
-      <w:r>
-        <w:t>(</w:t>
-      </w:r>
-      <w:proofErr w:type="spellStart"/>
-      <w:r>
-        <w:t>length</w:t>
-      </w:r>
-      <w:proofErr w:type="spellEnd"/>
-      <w:r>
-        <w:t>(b))</w:t>
+        <w:t>Impostazione della soluzione esatta x_exact = ones(length(b))</w:t>
       </w:r>
       <w:r>
         <w:t>;</w:t>
@@ -3847,58 +3479,34 @@
         <w:t xml:space="preserve"> viene: fatta l’e</w:t>
       </w:r>
       <w:r>
-        <w:t xml:space="preserve">secuzione dei </w:t>
-      </w:r>
-      <w:proofErr w:type="gramStart"/>
-      <w:r>
-        <w:t>4</w:t>
-      </w:r>
-      <w:proofErr w:type="gramEnd"/>
-      <w:r>
-        <w:t xml:space="preserve"> metodi iterativi</w:t>
+        <w:t>secuzione dei 4 metodi iterativi</w:t>
       </w:r>
       <w:r>
         <w:t xml:space="preserve"> (</w:t>
       </w:r>
-      <w:proofErr w:type="spellStart"/>
       <w:r>
         <w:t>jacobi_method</w:t>
       </w:r>
-      <w:proofErr w:type="spellEnd"/>
       <w:r>
         <w:t xml:space="preserve">, </w:t>
       </w:r>
-      <w:proofErr w:type="spellStart"/>
       <w:r>
         <w:t>gauss_seidel_method</w:t>
       </w:r>
-      <w:proofErr w:type="spellEnd"/>
       <w:r>
         <w:t xml:space="preserve">, </w:t>
       </w:r>
-      <w:proofErr w:type="spellStart"/>
       <w:r>
         <w:t>radient_descent_method</w:t>
       </w:r>
-      <w:proofErr w:type="spellEnd"/>
       <w:r>
         <w:t xml:space="preserve">, </w:t>
       </w:r>
-      <w:proofErr w:type="spellStart"/>
-      <w:r>
-        <w:t>conjugate_gradient_</w:t>
-      </w:r>
-      <w:proofErr w:type="gramStart"/>
-      <w:r>
-        <w:t>method</w:t>
-      </w:r>
-      <w:proofErr w:type="spellEnd"/>
-      <w:r>
-        <w:t xml:space="preserve"> )</w:t>
-      </w:r>
-      <w:proofErr w:type="gramEnd"/>
-      <w:r>
-        <w:t>, fatta la m</w:t>
+      <w:r>
+        <w:t>conjugate_gradient_method</w:t>
+      </w:r>
+      <w:r>
+        <w:t xml:space="preserve"> ), fatta la m</w:t>
       </w:r>
       <w:r>
         <w:t>isurazione del tempo di esecuzione con @elapsed</w:t>
@@ -3916,15 +3524,7 @@
         <w:t xml:space="preserve"> creato</w:t>
       </w:r>
       <w:r>
-        <w:t xml:space="preserve"> un dizionario </w:t>
-      </w:r>
-      <w:proofErr w:type="spellStart"/>
-      <w:r>
-        <w:t>results</w:t>
-      </w:r>
-      <w:proofErr w:type="spellEnd"/>
-      <w:r>
-        <w:t xml:space="preserve"> contenente tutti i dati</w:t>
+        <w:t xml:space="preserve"> un dizionario results contenente tutti i dati</w:t>
       </w:r>
       <w:r>
         <w:t xml:space="preserve"> in formato</w:t>
@@ -3936,15 +3536,7 @@
         <w:t xml:space="preserve"> che verranno poi salvati</w:t>
       </w:r>
       <w:r>
-        <w:t xml:space="preserve"> nella directory </w:t>
-      </w:r>
-      <w:proofErr w:type="spellStart"/>
-      <w:r>
-        <w:t>results</w:t>
-      </w:r>
-      <w:proofErr w:type="spellEnd"/>
-      <w:r>
-        <w:t>.</w:t>
+        <w:t xml:space="preserve"> nella directory results.</w:t>
       </w:r>
     </w:p>
     <w:p>
@@ -3952,7 +3544,7 @@
         <w:pStyle w:val="Titolo3"/>
         <w:spacing w:line="360" w:lineRule="auto"/>
       </w:pPr>
-      <w:bookmarkStart w:id="8" w:name="_Toc199776005"/>
+      <w:bookmarkStart w:id="8" w:name="_Toc199776793"/>
       <w:r>
         <w:lastRenderedPageBreak/>
         <w:t>Grafici</w:t>
@@ -3975,15 +3567,7 @@
         <w:t>Per ogni matrice</w:t>
       </w:r>
       <w:r>
-        <w:t xml:space="preserve">, tramite la libreria </w:t>
-      </w:r>
-      <w:proofErr w:type="spellStart"/>
-      <w:r>
-        <w:t>statsPlot</w:t>
-      </w:r>
-      <w:proofErr w:type="spellEnd"/>
-      <w:r>
-        <w:t xml:space="preserve"> e Plot,</w:t>
+        <w:t>, tramite la libreria statsPlot e Plot,</w:t>
       </w:r>
       <w:r>
         <w:t xml:space="preserve"> è stata effettuata la creazione di tre grafici</w:t>
@@ -4015,20 +3599,7 @@
         <w:spacing w:line="360" w:lineRule="auto"/>
       </w:pPr>
       <w:r>
-        <w:t xml:space="preserve">Lettura dei </w:t>
-      </w:r>
-      <w:proofErr w:type="gramStart"/>
-      <w:r>
-        <w:t>file .</w:t>
-      </w:r>
-      <w:proofErr w:type="spellStart"/>
-      <w:r>
-        <w:t>json</w:t>
-      </w:r>
-      <w:proofErr w:type="spellEnd"/>
-      <w:proofErr w:type="gramEnd"/>
-      <w:r>
-        <w:t xml:space="preserve"> generati</w:t>
+        <w:t>Lettura dei file .json generati</w:t>
       </w:r>
       <w:r>
         <w:t>;</w:t>
@@ -4114,18 +3685,8 @@
         <w:spacing w:line="360" w:lineRule="auto"/>
       </w:pPr>
       <w:r>
-        <w:t xml:space="preserve">Lettura delle iterazioni dai </w:t>
-      </w:r>
-      <w:proofErr w:type="gramStart"/>
-      <w:r>
-        <w:t>file .</w:t>
-      </w:r>
-      <w:proofErr w:type="spellStart"/>
-      <w:r>
-        <w:t>json</w:t>
-      </w:r>
-      <w:proofErr w:type="spellEnd"/>
-      <w:proofErr w:type="gramEnd"/>
+        <w:t>Lettura delle iterazioni dai file .json</w:t>
+      </w:r>
       <w:r>
         <w:t>;</w:t>
       </w:r>
@@ -4227,18 +3788,8 @@
         <w:spacing w:line="360" w:lineRule="auto"/>
       </w:pPr>
       <w:r>
-        <w:t xml:space="preserve">Lettura dei tempi (in millisecondi) dai </w:t>
-      </w:r>
-      <w:proofErr w:type="gramStart"/>
-      <w:r>
-        <w:t>file .</w:t>
-      </w:r>
-      <w:proofErr w:type="spellStart"/>
-      <w:r>
-        <w:t>json</w:t>
-      </w:r>
-      <w:proofErr w:type="spellEnd"/>
-      <w:proofErr w:type="gramEnd"/>
+        <w:t>Lettura dei tempi (in millisecondi) dai file .json</w:t>
+      </w:r>
       <w:r>
         <w:t>;</w:t>
       </w:r>
@@ -4336,7 +3887,7 @@
       <w:pPr>
         <w:pStyle w:val="Titolo1"/>
       </w:pPr>
-      <w:bookmarkStart w:id="9" w:name="_Toc199776006"/>
+      <w:bookmarkStart w:id="9" w:name="_Toc199776794"/>
       <w:r>
         <w:lastRenderedPageBreak/>
         <w:t>Analisi dei risultati ottenuti</w:t>
@@ -4347,7 +3898,7 @@
       <w:pPr>
         <w:pStyle w:val="Titolo2"/>
       </w:pPr>
-      <w:bookmarkStart w:id="10" w:name="_Toc199776007"/>
+      <w:bookmarkStart w:id="10" w:name="_Toc199776795"/>
       <w:r>
         <w:rPr>
           <w:noProof/>
@@ -4439,11 +3990,9 @@
         </w:numPr>
         <w:spacing w:line="360" w:lineRule="auto"/>
       </w:pPr>
-      <w:proofErr w:type="spellStart"/>
       <w:r>
         <w:t>Jacobi</w:t>
       </w:r>
-      <w:proofErr w:type="spellEnd"/>
     </w:p>
     <w:p>
       <w:pPr>
@@ -4487,15 +4036,7 @@
         <w:spacing w:line="360" w:lineRule="auto"/>
       </w:pPr>
       <w:r>
-        <w:t>Gauss-</w:t>
-      </w:r>
-      <w:proofErr w:type="spellStart"/>
-      <w:r>
-        <w:t>seidel</w:t>
-      </w:r>
-      <w:proofErr w:type="spellEnd"/>
-      <w:r>
-        <w:t>:</w:t>
+        <w:t>Gauss-seidel:</w:t>
       </w:r>
     </w:p>
     <w:p>
@@ -4508,15 +4049,7 @@
         <w:spacing w:line="360" w:lineRule="auto"/>
       </w:pPr>
       <w:r>
-        <w:t xml:space="preserve">Mostra un comportamento similare a quello del metodo di </w:t>
-      </w:r>
-      <w:proofErr w:type="spellStart"/>
-      <w:r>
-        <w:t>jacobi</w:t>
-      </w:r>
-      <w:proofErr w:type="spellEnd"/>
-      <w:r>
-        <w:t>, anche se mostra errore leggermente maggiore per stesse tolleranze.</w:t>
+        <w:t>Mostra un comportamento similare a quello del metodo di jacobi, anche se mostra errore leggermente maggiore per stesse tolleranze.</w:t>
       </w:r>
     </w:p>
     <w:p>
@@ -4609,13 +4142,8 @@
         </w:numPr>
         <w:spacing w:line="360" w:lineRule="auto"/>
       </w:pPr>
-      <w:proofErr w:type="gramStart"/>
-      <w:r>
-        <w:t>Tuttavia</w:t>
-      </w:r>
-      <w:proofErr w:type="gramEnd"/>
-      <w:r>
-        <w:t xml:space="preserve"> l’errore cresce a partire da 1e</w:t>
+      <w:r>
+        <w:t>Tuttavia l’errore cresce a partire da 1e</w:t>
       </w:r>
       <w:r>
         <w:rPr>
@@ -4900,13 +4428,8 @@
         </w:numPr>
         <w:spacing w:line="360" w:lineRule="auto"/>
       </w:pPr>
-      <w:proofErr w:type="spellStart"/>
-      <w:r>
-        <w:t>Jacobi</w:t>
-      </w:r>
-      <w:proofErr w:type="spellEnd"/>
-      <w:r>
-        <w:t xml:space="preserve"> (blu)</w:t>
+      <w:r>
+        <w:t>Jacobi (blu)</w:t>
       </w:r>
       <w:r>
         <w:t xml:space="preserve">: </w:t>
@@ -4928,13 +4451,8 @@
         <w:spacing w:line="360" w:lineRule="auto"/>
       </w:pPr>
       <w:r>
-        <w:t>Gauss-</w:t>
-      </w:r>
-      <w:proofErr w:type="spellStart"/>
-      <w:r>
-        <w:t>seidel</w:t>
-      </w:r>
-      <w:proofErr w:type="spellEnd"/>
+        <w:t>Gauss-seidel</w:t>
+      </w:r>
       <w:r>
         <w:t xml:space="preserve"> (rosso)</w:t>
       </w:r>
@@ -5017,7 +4535,7 @@
       <w:pPr>
         <w:pStyle w:val="Titolo2"/>
       </w:pPr>
-      <w:bookmarkStart w:id="11" w:name="_Toc199776008"/>
+      <w:bookmarkStart w:id="11" w:name="_Toc199776796"/>
       <w:r>
         <w:rPr>
           <w:noProof/>
@@ -5111,13 +4629,8 @@
         </w:numPr>
         <w:spacing w:line="360" w:lineRule="auto"/>
       </w:pPr>
-      <w:proofErr w:type="spellStart"/>
-      <w:r>
-        <w:t>Jacobi</w:t>
-      </w:r>
-      <w:proofErr w:type="spellEnd"/>
-      <w:r>
-        <w:t>:</w:t>
+      <w:r>
+        <w:t>Jacobi:</w:t>
       </w:r>
     </w:p>
     <w:p>
@@ -5143,15 +4656,7 @@
         <w:spacing w:line="360" w:lineRule="auto"/>
       </w:pPr>
       <w:r>
-        <w:t>Gauss-</w:t>
-      </w:r>
-      <w:proofErr w:type="spellStart"/>
-      <w:r>
-        <w:t>seidel</w:t>
-      </w:r>
-      <w:proofErr w:type="spellEnd"/>
-      <w:r>
-        <w:t>:</w:t>
+        <w:t>Gauss-seidel:</w:t>
       </w:r>
     </w:p>
     <w:p>
@@ -5164,15 +4669,7 @@
         <w:spacing w:line="360" w:lineRule="auto"/>
       </w:pPr>
       <w:r>
-        <w:t xml:space="preserve">Mostra un comportamento similare a quello del metodo di </w:t>
-      </w:r>
-      <w:proofErr w:type="spellStart"/>
-      <w:r>
-        <w:t>jacobi</w:t>
-      </w:r>
-      <w:proofErr w:type="spellEnd"/>
-      <w:r>
-        <w:t>, lievemente migliore.</w:t>
+        <w:t>Mostra un comportamento similare a quello del metodo di jacobi, lievemente migliore.</w:t>
       </w:r>
     </w:p>
     <w:p>
@@ -5388,7 +4885,7 @@
       <w:pPr>
         <w:pStyle w:val="Titolo2"/>
       </w:pPr>
-      <w:bookmarkStart w:id="12" w:name="_Toc199776009"/>
+      <w:bookmarkStart w:id="12" w:name="_Toc199776797"/>
       <w:r>
         <w:lastRenderedPageBreak/>
         <w:t>Matrice Vem1</w:t>
@@ -5470,13 +4967,8 @@
         </w:numPr>
         <w:spacing w:line="360" w:lineRule="auto"/>
       </w:pPr>
-      <w:proofErr w:type="spellStart"/>
-      <w:r>
-        <w:t>Jacobi</w:t>
-      </w:r>
-      <w:proofErr w:type="spellEnd"/>
-      <w:r>
-        <w:t>:</w:t>
+      <w:r>
+        <w:t>Jacobi:</w:t>
       </w:r>
     </w:p>
     <w:p>
@@ -5489,15 +4981,7 @@
         <w:spacing w:line="360" w:lineRule="auto"/>
       </w:pPr>
       <w:r>
-        <w:t xml:space="preserve">Il metodo </w:t>
-      </w:r>
-      <w:proofErr w:type="spellStart"/>
-      <w:r>
-        <w:t>Jacobi</w:t>
-      </w:r>
-      <w:proofErr w:type="spellEnd"/>
-      <w:r>
-        <w:t xml:space="preserve"> mostra l’errore più alto tra tutti</w:t>
+        <w:t>Il metodo Jacobi mostra l’errore più alto tra tutti</w:t>
       </w:r>
       <w:r>
         <w:t xml:space="preserve"> il quale</w:t>
@@ -5506,10 +4990,7 @@
         <w:t xml:space="preserve"> cresce regolarmente con la tolleranza ma converge lentamente, risultando poco efficiente per problemi come VEM</w:t>
       </w:r>
       <w:r>
-        <w:t>1</w:t>
-      </w:r>
-      <w:r>
-        <w:t>;</w:t>
+        <w:t>1;</w:t>
       </w:r>
     </w:p>
     <w:p>
@@ -5522,15 +5003,7 @@
         <w:spacing w:line="360" w:lineRule="auto"/>
       </w:pPr>
       <w:r>
-        <w:t>Gauss-</w:t>
-      </w:r>
-      <w:proofErr w:type="spellStart"/>
-      <w:r>
-        <w:t>seidel</w:t>
-      </w:r>
-      <w:proofErr w:type="spellEnd"/>
-      <w:r>
-        <w:t>:</w:t>
+        <w:t>Gauss-seidel:</w:t>
       </w:r>
     </w:p>
     <w:p>
@@ -5543,15 +5016,7 @@
         <w:spacing w:line="360" w:lineRule="auto"/>
       </w:pPr>
       <w:r>
-        <w:t xml:space="preserve">Presenta un comportamento simile a quello del metodo di </w:t>
-      </w:r>
-      <w:proofErr w:type="spellStart"/>
-      <w:r>
-        <w:t>jacobi</w:t>
-      </w:r>
-      <w:proofErr w:type="spellEnd"/>
-      <w:r>
-        <w:t xml:space="preserve"> risultando sempre inferiore ai metodi del gradiente;</w:t>
+        <w:t>Presenta un comportamento simile a quello del metodo di jacobi risultando sempre inferiore ai metodi del gradiente;</w:t>
       </w:r>
     </w:p>
     <w:p>
@@ -5580,15 +5045,7 @@
         <w:t>M</w:t>
       </w:r>
       <w:r>
-        <w:t xml:space="preserve">igliora ulteriormente la precisione rispetto ai metodi di </w:t>
-      </w:r>
-      <w:proofErr w:type="spellStart"/>
-      <w:r>
-        <w:t>Jacobi</w:t>
-      </w:r>
-      <w:proofErr w:type="spellEnd"/>
-      <w:r>
-        <w:t xml:space="preserve"> e Gauss-Seidel. L’errore relativo si riduce con la tolleranza in modo simile, ma si mantiene costantemente più basso, indicando una migliore capacità di avvicinarsi alla soluzione esatta</w:t>
+        <w:t>igliora ulteriormente la precisione rispetto ai metodi di Jacobi e Gauss-Seidel. L’errore relativo si riduce con la tolleranza in modo simile, ma si mantiene costantemente più basso, indicando una migliore capacità di avvicinarsi alla soluzione esatta</w:t>
       </w:r>
       <w:r>
         <w:t>;</w:t>
@@ -5786,19 +5243,11 @@
         </w:numPr>
         <w:spacing w:line="360" w:lineRule="auto"/>
       </w:pPr>
-      <w:proofErr w:type="spellStart"/>
-      <w:r>
-        <w:t>Jacobi</w:t>
-      </w:r>
-      <w:proofErr w:type="spellEnd"/>
-      <w:r>
-        <w:t xml:space="preserve"> (blu):</w:t>
-      </w:r>
-      <w:r>
-        <w:t xml:space="preserve"> </w:t>
-      </w:r>
-      <w:r>
-        <w:t>mostra un aumento marcato del numero di iterazioni, da 1315 a 4672,</w:t>
+      <w:r>
+        <w:t>Jacobi (blu):</w:t>
+      </w:r>
+      <w:r>
+        <w:t xml:space="preserve"> mostra un aumento marcato del numero di iterazioni, da 1315 a 4672,</w:t>
       </w:r>
       <w:r>
         <w:t xml:space="preserve"> mostrando rapidità per quanto riguarda il tempo che tende ad aumentare di poco con tolleranze più strette</w:t>
@@ -5817,29 +5266,10 @@
         <w:spacing w:line="360" w:lineRule="auto"/>
       </w:pPr>
       <w:r>
-        <w:t>Gauss-</w:t>
-      </w:r>
-      <w:proofErr w:type="spellStart"/>
-      <w:r>
-        <w:t>seidel</w:t>
-      </w:r>
-      <w:proofErr w:type="spellEnd"/>
-      <w:r>
-        <w:t xml:space="preserve"> (rosso):</w:t>
-      </w:r>
-      <w:r>
-        <w:t xml:space="preserve"> </w:t>
-      </w:r>
-      <w:r>
-        <w:t xml:space="preserve">migliora sensibilmente rispetto a </w:t>
-      </w:r>
-      <w:proofErr w:type="spellStart"/>
-      <w:r>
-        <w:t>Jacobi</w:t>
-      </w:r>
-      <w:proofErr w:type="spellEnd"/>
-      <w:r>
-        <w:t xml:space="preserve"> ma resta comunque dispendioso (da 660 a 2339 iterazioni</w:t>
+        <w:t>Gauss-seidel (rosso):</w:t>
+      </w:r>
+      <w:r>
+        <w:t xml:space="preserve"> migliora sensibilmente rispetto a Jacobi ma resta comunque dispendioso (da 660 a 2339 iterazioni</w:t>
       </w:r>
       <w:r>
         <w:t>), soprattutto a livello di tempo (è il più lungo)</w:t>
@@ -5858,21 +5288,10 @@
         <w:spacing w:line="360" w:lineRule="auto"/>
       </w:pPr>
       <w:r>
-        <w:t>Gradiente (verde):</w:t>
-      </w:r>
-      <w:r>
-        <w:t xml:space="preserve"> </w:t>
-      </w:r>
-      <w:r>
-        <w:t xml:space="preserve">tempistiche simili a </w:t>
-      </w:r>
-      <w:proofErr w:type="spellStart"/>
-      <w:r>
-        <w:t>Jacobi</w:t>
-      </w:r>
-      <w:proofErr w:type="spellEnd"/>
-      <w:r>
-        <w:t xml:space="preserve">, mentre per quanto riguarda le iterazioni risulta </w:t>
+        <w:t xml:space="preserve">Gradiente (verde): </w:t>
+      </w:r>
+      <w:r>
+        <w:t xml:space="preserve">tempistiche simili a Jacobi, mentre per quanto riguarda le iterazioni risulta </w:t>
       </w:r>
       <w:r>
         <w:t>simile a Gauss-Seidel, con numeri elevati di iterazioni che superano le 3000 per tolleranze strette</w:t>
@@ -5892,10 +5311,7 @@
       </w:pPr>
       <w:r>
         <w:lastRenderedPageBreak/>
-        <w:t>Gradiente coniugato (fucsia):</w:t>
-      </w:r>
-      <w:r>
-        <w:t xml:space="preserve"> </w:t>
+        <w:t xml:space="preserve">Gradiente coniugato (fucsia): </w:t>
       </w:r>
       <w:r>
         <w:t xml:space="preserve">è il </w:t>
@@ -5928,7 +5344,7 @@
       <w:pPr>
         <w:pStyle w:val="Titolo2"/>
       </w:pPr>
-      <w:bookmarkStart w:id="13" w:name="_Toc199776010"/>
+      <w:bookmarkStart w:id="13" w:name="_Toc199776798"/>
       <w:r>
         <w:lastRenderedPageBreak/>
         <w:t>Matrice Vem2</w:t>
@@ -5998,42 +5414,7 @@
         <w:spacing w:line="360" w:lineRule="auto"/>
       </w:pPr>
       <w:r>
-        <w:t xml:space="preserve">Per quanto riguarda l’errore relativo in funzione della tolleranza, anche per la matrice VEM2 si osserva un comportamento molto simile a quello riscontrato per la matrice VEM1. In particolare, il metodo </w:t>
-      </w:r>
-      <w:proofErr w:type="spellStart"/>
-      <w:r>
-        <w:t>Jacobi</w:t>
-      </w:r>
-      <w:proofErr w:type="spellEnd"/>
-      <w:r>
-        <w:t xml:space="preserve"> e Gauss-Seidel</w:t>
-      </w:r>
-      <w:r>
-        <w:t xml:space="preserve"> si confer</w:t>
-      </w:r>
-      <w:r>
-        <w:t>mano</w:t>
-      </w:r>
-      <w:r>
-        <w:t xml:space="preserve"> i meno precis</w:t>
-      </w:r>
-      <w:r>
-        <w:t>i</w:t>
-      </w:r>
-      <w:r>
-        <w:t>, con l’errore più elevato e una convergenza lenta, che peggiora al diminuire della tolleranza.</w:t>
-      </w:r>
-      <w:r>
-        <w:t xml:space="preserve"> </w:t>
-      </w:r>
-      <w:r>
-        <w:t xml:space="preserve">Il metodo del gradiente offre un errore </w:t>
-      </w:r>
-      <w:r>
-        <w:t>leggermente</w:t>
-      </w:r>
-      <w:r>
-        <w:t xml:space="preserve"> più contenuto e una maggiore capacità di avvicinarsi alla soluzione esatta. Infine, il metodo del gradiente coniugato si distingue nettamente per accuratezza e stabilità numerica, con un errore relativo significativamente inferiore e una performance costante su tutto l’intervallo di tolleranza.</w:t>
+        <w:t>Per quanto riguarda l’errore relativo in funzione della tolleranza, anche per la matrice VEM2 si osserva un comportamento molto simile a quello riscontrato per la matrice VEM1. In particolare, il metodo Jacobi e Gauss-Seidel si confermano i meno precisi, con l’errore più elevato e una convergenza lenta, che peggiora al diminuire della tolleranza. Il metodo del gradiente offre un errore leggermente più contenuto e una maggiore capacità di avvicinarsi alla soluzione esatta. Infine, il metodo del gradiente coniugato si distingue nettamente per accuratezza e stabilità numerica, con un errore relativo significativamente inferiore e una performance costante su tutto l’intervallo di tolleranza.</w:t>
       </w:r>
     </w:p>
     <w:p>
@@ -6162,18 +5543,7 @@
         <w:spacing w:line="360" w:lineRule="auto"/>
       </w:pPr>
       <w:r>
-        <w:t>I grafici sopra riportati</w:t>
-      </w:r>
-      <w:r>
-        <w:t xml:space="preserve"> mostrano un andamento del numero di iterazioni e dei tempi di calcolo molto simile a quanto osservato per VEM1. Le tendenze relative all'efficienza e alla stabilità dei metodi sono le stesse: il metodo </w:t>
-      </w:r>
-      <w:proofErr w:type="spellStart"/>
-      <w:r>
-        <w:t>Jacobi</w:t>
-      </w:r>
-      <w:proofErr w:type="spellEnd"/>
-      <w:r>
-        <w:t xml:space="preserve"> richiede molte iterazioni, Gauss-Seidel migliora leggermente ma risulta il più lento in termini di tempo, il metodo del gradiente si comporta in modo intermedio, mentre il gradiente coniugato si conferma il più efficiente sia per numero di iterazioni che per tempo.</w:t>
+        <w:t>I grafici sopra riportati mostrano un andamento del numero di iterazioni e dei tempi di calcolo molto simile a quanto osservato per VEM1. Le tendenze relative all'efficienza e alla stabilità dei metodi sono le stesse: il metodo Jacobi richiede molte iterazioni, Gauss-Seidel migliora leggermente ma risulta il più lento in termini di tempo, il metodo del gradiente si comporta in modo intermedio, mentre il gradiente coniugato si conferma il più efficiente sia per numero di iterazioni che per tempo.</w:t>
       </w:r>
     </w:p>
     <w:p>
@@ -6189,10 +5559,12 @@
       <w:pPr>
         <w:pStyle w:val="Titolo1"/>
       </w:pPr>
+      <w:bookmarkStart w:id="14" w:name="_Toc199776799"/>
       <w:r>
         <w:lastRenderedPageBreak/>
         <w:t>Conclusioni</w:t>
       </w:r>
+      <w:bookmarkEnd w:id="14"/>
     </w:p>
     <w:p>
       <w:pPr>
@@ -6376,7 +5748,6 @@
                 <w:bCs w:val="0"/>
               </w:rPr>
             </w:pPr>
-            <w:proofErr w:type="spellStart"/>
             <w:r>
               <w:rPr>
                 <w:b w:val="0"/>
@@ -6384,7 +5755,6 @@
               </w:rPr>
               <w:t>Jacobi</w:t>
             </w:r>
-            <w:proofErr w:type="spellEnd"/>
           </w:p>
         </w:tc>
         <w:tc>
@@ -6752,31 +6122,15 @@
         <w:spacing w:line="360" w:lineRule="auto"/>
       </w:pPr>
       <w:r>
-        <w:t xml:space="preserve">Per quanto riguarda le matrici Spa1 e Spa2, i metodi di </w:t>
-      </w:r>
-      <w:proofErr w:type="spellStart"/>
-      <w:r>
-        <w:t>Jacobi</w:t>
-      </w:r>
-      <w:proofErr w:type="spellEnd"/>
-      <w:r>
-        <w:t xml:space="preserve"> e Gauss-Seidel si sono dimostrati affidabili per tolleranze strette, garantendo errori contenuti e stabili. Tra i due, Gauss-Seidel ha richiesto un numero minore di iterazioni, a scapito però di un tempo di esecuzione più elevato. Il metodo del Gradiente si è rivelato il meno efficiente sia in termini di accuratezza che di velocità, mostrando convergenza lenta e instabilità numerica. Al contrario, il metodo del Gradiente Coniugato ha offerto le prestazioni migliori per tolleranze strette, distinguendosi per precisione, ma ha mostrato un leggero peggioramento con tolleranze meno restrittive (≥ 1e-6), avvicinandosi in tal caso alle prestazioni del gradiente classico.</w:t>
-      </w:r>
-    </w:p>
-    <w:p>
-      <w:pPr>
-        <w:spacing w:line="360" w:lineRule="auto"/>
-      </w:pPr>
-      <w:r>
-        <w:t xml:space="preserve">Nel caso delle matrici Vem1 e Vem2, i metodi </w:t>
-      </w:r>
-      <w:proofErr w:type="spellStart"/>
-      <w:r>
-        <w:t>Jacobi</w:t>
-      </w:r>
-      <w:proofErr w:type="spellEnd"/>
-      <w:r>
-        <w:t xml:space="preserve"> e Gauss-Seidel hanno evidenziato limiti maggiori: l’errore relativo risulta più alto, la convergenza più lenta e il numero di iterazioni richiesto cresce significativamente con la tolleranza. Il metodo del Gradiente, pur migliorando rispetto ai metodi classici, ha mantenuto tempi di esecuzione elevati e un numero consistente di iterazioni. Il Gradiente Coniugato si conferma invece il più performante anche in questi scenari: ha richiesto un numero molto contenuto di iterazioni, ha mantenuto tempi di esecuzione ridotti e ha mostrato una stabilità numerica eccellente su tutto l’intervallo di tolleranza.</w:t>
+        <w:t>Per quanto riguarda le matrici Spa1 e Spa2, i metodi di Jacobi e Gauss-Seidel si sono dimostrati affidabili per tolleranze strette, garantendo errori contenuti e stabili. Tra i due, Gauss-Seidel ha richiesto un numero minore di iterazioni, a scapito però di un tempo di esecuzione più elevato. Il metodo del Gradiente si è rivelato il meno efficiente sia in termini di accuratezza che di velocità, mostrando convergenza lenta e instabilità numerica. Al contrario, il metodo del Gradiente Coniugato ha offerto le prestazioni migliori per tolleranze strette, distinguendosi per precisione, ma ha mostrato un leggero peggioramento con tolleranze meno restrittive (≥ 1e-6), avvicinandosi in tal caso alle prestazioni del gradiente classico.</w:t>
+      </w:r>
+    </w:p>
+    <w:p>
+      <w:pPr>
+        <w:spacing w:line="360" w:lineRule="auto"/>
+      </w:pPr>
+      <w:r>
+        <w:t>Nel caso delle matrici Vem1 e Vem2, i metodi Jacobi e Gauss-Seidel hanno evidenziato limiti maggiori: l’errore relativo risulta più alto, la convergenza più lenta e il numero di iterazioni richiesto cresce significativamente con la tolleranza. Il metodo del Gradiente, pur migliorando rispetto ai metodi classici, ha mantenuto tempi di esecuzione elevati e un numero consistente di iterazioni. Il Gradiente Coniugato si conferma invece il più performante anche in questi scenari: ha richiesto un numero molto contenuto di iterazioni, ha mantenuto tempi di esecuzione ridotti e ha mostrato una stabilità numerica eccellente su tutto l’intervallo di tolleranza.</w:t>
       </w:r>
     </w:p>
     <w:p>
@@ -6797,15 +6151,7 @@
       </w:pPr>
       <w:r>
         <w:lastRenderedPageBreak/>
-        <w:t xml:space="preserve">I metodi </w:t>
-      </w:r>
-      <w:proofErr w:type="spellStart"/>
-      <w:r>
-        <w:t>Jacobi</w:t>
-      </w:r>
-      <w:proofErr w:type="spellEnd"/>
-      <w:r>
-        <w:t xml:space="preserve"> e Gauss-Seidel sono semplici da implementare e affidabili su problemi di media complessità, ma meno adatti a sistemi di grandi dimensioni o con struttura complessa.</w:t>
+        <w:t>I metodi Jacobi e Gauss-Seidel sono semplici da implementare e affidabili su problemi di media complessità, ma meno adatti a sistemi di grandi dimensioni o con struttura complessa.</w:t>
       </w:r>
     </w:p>
     <w:p>
@@ -8380,6 +7726,7 @@
   <w:style w:type="character" w:default="1" w:styleId="Carpredefinitoparagrafo">
     <w:name w:val="Default Paragraph Font"/>
     <w:uiPriority w:val="1"/>
+    <w:semiHidden/>
     <w:unhideWhenUsed/>
   </w:style>
   <w:style w:type="table" w:default="1" w:styleId="Tabellanormale">

</xml_diff>